<commit_message>
Correct MBB figures after fact check
Fact-checked every number against Vietnamese financial press. Four fixes:

- Total assets 2025 were 1.615.764 tỷ (+43%), not ~1,5 triệu tỷ (+33%). The
  lower number was MB's early-January estimate, still circulating in
  secondary coverage. Chart on slide 3 and speaker notes corrected.
- Slide 6 anchored asset growth to Q1/2026; assets in fact slipped 0,3% that
  quarter. Re-anchored to the end-2025 balance sheet.
- ROE stated as 21,6%; MB's own 2025 disclosure is 21,1%.
- Target-price range omitted VCBS at 37.230, the high end. Now 32.900-37.230.

README gains a per-figure verification status and records three caveats:
the equity series is a broker projection, CASA leadership is a narrow lead
Techcombank held at 9M2025, and Q1/2026 saw deposit outflows the deck
does not show.

Co-Authored-By: Claude Opus 5 <noreply@anthropic.com>
Claude-Session: https://claude.ai/code/session_01W4wnn8T5rpb6YmEh93LGX5
</commit_message>
<xml_diff>
--- a/hotstock-mbb/HotStock_MBB_2026.docx
+++ b/hotstock-mbb/HotStock_MBB_2026.docx
@@ -87,7 +87,7 @@
           <w:sz w:val="20"/>
           <w:szCs w:val="20"/>
         </w:rPr>
-        <w:t xml:space="preserve">MBB hiện giao dịch quanh mức P/B khoảng 1,4 lần, nhưng tính trên giá trị sổ sách dự phóng năm 2026 thì P/B chỉ còn khoảng 1,2 lần – một mức hợp lý với ngân hàng đang có ROE trên 21%.</w:t>
+        <w:t xml:space="preserve">MBB hiện giao dịch quanh mức P/B khoảng 1,4 lần, nhưng tính trên giá trị sổ sách dự phóng năm 2026 thì P/B chỉ còn khoảng 1,2 lần – một mức hợp lý với ngân hàng đạt ROE 21,1% trong năm 2025.</w:t>
       </w:r>
     </w:p>
     <w:p>
@@ -110,7 +110,7 @@
           <w:sz w:val="20"/>
           <w:szCs w:val="20"/>
         </w:rPr>
-        <w:t xml:space="preserve">Đây là mức sinh lời thuộc nhóm cao nhất trong các ngân hàng quy mô lớn. Các nhóm phân tích trên thị trường hiện đưa ra giá mục tiêu cho MBB trong vùng 32.900 – 33.900 đồng mỗi cổ phiếu. </w:t>
+        <w:t xml:space="preserve">Đây là mức sinh lời thuộc nhóm cao nhất trong các ngân hàng quy mô lớn. Các nhóm phân tích trên thị trường hiện đưa ra giá mục tiêu cho MBB trong vùng 32.900 – 37.230 đồng mỗi cổ phiếu. </w:t>
       </w:r>
     </w:p>
     <w:p>
@@ -265,7 +265,7 @@
           <w:sz w:val="20"/>
           <w:szCs w:val="20"/>
         </w:rPr>
-        <w:t xml:space="preserve">Sau khi nhận chuyển giao bắt buộc ngân hàng MBV, MBB được giao hạn mức tăng trưởng tín dụng thuộc nhóm cao nhất thị trường cho giai đoạn 2026 – 2028, với mục tiêu tăng trưởng tín dụng năm nay quanh mức 30%. </w:t>
+        <w:t xml:space="preserve">Sau khi nhận chuyển giao bắt buộc ngân hàng MBV, MBB được giao hạn mức tăng trưởng tín dụng thuộc nhóm cao nhất thị trường cho giai đoạn 2026 – 2028, với mục tiêu tăng trưởng tín dụng năm nay trong khoảng 30 – 35%. </w:t>
       </w:r>
     </w:p>
     <w:p>
@@ -289,7 +289,7 @@
           <w:sz w:val="20"/>
           <w:szCs w:val="20"/>
         </w:rPr>
-        <w:t xml:space="preserve">Quy mô cũng đang bứt tốc: tổng tài sản đã vượt 1,6 triệu tỷ đồng tại cuối quý I năm 2026 và ngân hàng đặt mục tiêu vượt 2,1 triệu tỷ đồng trong năm nay, đi cùng nhu cầu vốn lớn từ các dự án hạ tầng và đầu tư công. </w:t>
+        <w:t xml:space="preserve">Quy mô cũng đang bứt tốc: tổng tài sản đạt hơn 1,61 triệu tỷ đồng vào cuối năm 2025, tăng 43% chỉ trong một năm, và ngân hàng đặt mục tiêu vượt 2,1 triệu tỷ đồng trong năm 2026, đi cùng nhu cầu vốn lớn từ các dự án hạ tầng và đầu tư công. </w:t>
       </w:r>
     </w:p>
     <w:p>

</xml_diff>